<commit_message>
Header toplam paket alanini ekle
</commit_message>
<xml_diff>
--- a/netprobe_teknik_rapor.docx
+++ b/netprobe_teknik_rapor.docx
@@ -2373,7 +2373,7 @@
               <w:rPr>
                 <w:sz w:val="16"/>
               </w:rPr>
-              <w:t>checksum</w:t>
+              <w:t>total_packets</w:t>
             </w:r>
           </w:p>
         </w:tc>
@@ -2399,7 +2399,7 @@
               <w:rPr>
                 <w:sz w:val="16"/>
               </w:rPr>
-              <w:t>16 byte</w:t>
+              <w:t>4 byte</w:t>
             </w:r>
           </w:p>
         </w:tc>
@@ -2425,7 +2425,7 @@
               <w:rPr>
                 <w:sz w:val="16"/>
               </w:rPr>
-              <w:t>MD5 digest calculated over the compressed payload</w:t>
+              <w:t>Total DATA packet count for the current transfer</w:t>
             </w:r>
           </w:p>
         </w:tc>
@@ -2453,7 +2453,7 @@
               <w:rPr>
                 <w:sz w:val="16"/>
               </w:rPr>
-              <w:t>payload</w:t>
+              <w:t>checksum</w:t>
             </w:r>
           </w:p>
         </w:tc>
@@ -2479,7 +2479,7 @@
               <w:rPr>
                 <w:sz w:val="16"/>
               </w:rPr>
-              <w:t>Variable</w:t>
+              <w:t>16 byte</w:t>
             </w:r>
           </w:p>
         </w:tc>
@@ -2505,7 +2505,7 @@
               <w:rPr>
                 <w:sz w:val="16"/>
               </w:rPr>
-              <w:t>zlib-compressed data; DATA carries file chunks, START/END carries JSON metadata</w:t>
+              <w:t>MD5 digest calculated over the compressed payload</w:t>
             </w:r>
           </w:p>
         </w:tc>
@@ -2533,7 +2533,7 @@
               <w:rPr>
                 <w:sz w:val="16"/>
               </w:rPr>
-              <w:t>byte_order</w:t>
+              <w:t>payload</w:t>
             </w:r>
           </w:p>
         </w:tc>
@@ -2559,7 +2559,7 @@
               <w:rPr>
                 <w:sz w:val="16"/>
               </w:rPr>
-              <w:t>-</w:t>
+              <w:t>Variable</w:t>
             </w:r>
           </w:p>
         </w:tc>
@@ -2585,7 +2585,7 @@
               <w:rPr>
                 <w:sz w:val="16"/>
               </w:rPr>
-              <w:t>Network byte order is used; header format is !BI16s</w:t>
+              <w:t>zlib-compressed data; DATA carries file chunks, START/END carries JSON metadata</w:t>
             </w:r>
           </w:p>
         </w:tc>
@@ -2613,7 +2613,7 @@
               <w:rPr>
                 <w:sz w:val="16"/>
               </w:rPr>
-              <w:t>chunk_size</w:t>
+              <w:t>byte_order</w:t>
             </w:r>
           </w:p>
         </w:tc>
@@ -2639,7 +2639,7 @@
               <w:rPr>
                 <w:sz w:val="16"/>
               </w:rPr>
-              <w:t>1024 byte</w:t>
+              <w:t>-</w:t>
             </w:r>
           </w:p>
         </w:tc>
@@ -2665,7 +2665,7 @@
               <w:rPr>
                 <w:sz w:val="16"/>
               </w:rPr>
-              <w:t>Default file chunk size</w:t>
+              <w:t>Network byte order is used; header format is !BII16s</w:t>
             </w:r>
           </w:p>
         </w:tc>
@@ -3315,10 +3315,7 @@
         <w:spacing w:after="80"/>
       </w:pPr>
       <w:r>
-        <w:rPr>
-          <w:sz w:val="21"/>
-        </w:rPr>
-        <w:t>utils.py - Packet constants, header format, zlib compression/decompression, MD5 packet checksum, SHA-256 file checksum, and JSON metadata helpers.</w:t>
+        <w:t>utils.py - Packet constants, header format (!BII16s), zlib compression/decompression, MD5 packet checksum, SHA-256 file checksum, and JSON metadata helpers.</w:t>
       </w:r>
     </w:p>
     <w:p>

</xml_diff>

<commit_message>
Ilk iki hafta rapor kontrolunu tamamla
</commit_message>
<xml_diff>
--- a/netprobe_teknik_rapor.docx
+++ b/netprobe_teknik_rapor.docx
@@ -1729,14 +1729,9 @@
       </w:pPr>
       <w:r>
         <w:rPr>
-          <w:rFonts w:ascii="Arial" w:cs="Arial" w:eastAsia="Arial" w:hAnsi="Arial"/>
-          <w:i/>
-          <w:iCs/>
-          <w:color w:val="856404"/>
-          <w:sz w:val="22"/>
-          <w:szCs w:val="22"/>
-        </w:rPr>
-        <w:t xml:space="preserve">[TODO: Mimari diyagramını buraya ekleyin (bileşenler arası oklar ve veri akışı gösterilmeli)]</w:t>
+          <w:sz w:val="21"/>
+        </w:rPr>
+        <w:t>Mimari akis: [Client] -- START/DATA/END UDP packets --&gt; [Server]; [Server] -- ACK/OK UDP packets --&gt; [Client]. Client tarafinda transfer_logs.csv uretilir; server dogrulanan dosyalari received_files/ klasorune yazar.</w:t>
       </w:r>
     </w:p>
     <w:p>

</xml_diff>